<commit_message>
feat: add application configuration and structured logging
</commit_message>
<xml_diff>
--- a/Documentation.docx
+++ b/Documentation.docx
@@ -107,8 +107,13 @@
           </w:tcPr>
           <w:p>
             <w:r>
-              <w:t>.dll</w:t>
-            </w:r>
+              <w:t>.</w:t>
+            </w:r>
+            <w:proofErr w:type="spellStart"/>
+            <w:r>
+              <w:t>dll</w:t>
+            </w:r>
+            <w:proofErr w:type="spellEnd"/>
           </w:p>
         </w:tc>
         <w:tc>
@@ -174,9 +179,16 @@
             <w:vAlign w:val="center"/>
           </w:tcPr>
           <w:p>
-            <w:r>
-              <w:t>.dylib</w:t>
-            </w:r>
+            <w:proofErr w:type="gramStart"/>
+            <w:r>
+              <w:t>.</w:t>
+            </w:r>
+            <w:proofErr w:type="spellStart"/>
+            <w:r>
+              <w:t>dylib</w:t>
+            </w:r>
+            <w:proofErr w:type="spellEnd"/>
+            <w:proofErr w:type="gramEnd"/>
           </w:p>
         </w:tc>
         <w:tc>
@@ -509,6 +521,232 @@
       </w:tr>
     </w:tbl>
     <w:p/>
+    <w:p>
+      <w:pPr>
+        <w:pStyle w:val="ListParagraph"/>
+        <w:numPr>
+          <w:ilvl w:val="0"/>
+          <w:numId w:val="2"/>
+        </w:numPr>
+      </w:pPr>
+      <w:r>
+        <w:t xml:space="preserve">Order of field which feed the hash </w:t>
+      </w:r>
+    </w:p>
+    <w:p>
+      <w:pPr>
+        <w:pStyle w:val="ListParagraph"/>
+        <w:numPr>
+          <w:ilvl w:val="1"/>
+          <w:numId w:val="2"/>
+        </w:numPr>
+      </w:pPr>
+      <w:r>
+        <w:t>Index</w:t>
+      </w:r>
+    </w:p>
+    <w:p>
+      <w:pPr>
+        <w:pStyle w:val="ListParagraph"/>
+        <w:numPr>
+          <w:ilvl w:val="1"/>
+          <w:numId w:val="2"/>
+        </w:numPr>
+      </w:pPr>
+      <w:r>
+        <w:t>Timestamp</w:t>
+      </w:r>
+    </w:p>
+    <w:p>
+      <w:pPr>
+        <w:pStyle w:val="ListParagraph"/>
+        <w:numPr>
+          <w:ilvl w:val="1"/>
+          <w:numId w:val="2"/>
+        </w:numPr>
+      </w:pPr>
+      <w:r>
+        <w:t>Transactions</w:t>
+      </w:r>
+    </w:p>
+    <w:p>
+      <w:pPr>
+        <w:pStyle w:val="ListParagraph"/>
+        <w:numPr>
+          <w:ilvl w:val="1"/>
+          <w:numId w:val="2"/>
+        </w:numPr>
+      </w:pPr>
+      <w:proofErr w:type="spellStart"/>
+      <w:r>
+        <w:t>PreviousHash</w:t>
+      </w:r>
+      <w:proofErr w:type="spellEnd"/>
+    </w:p>
+    <w:p>
+      <w:pPr>
+        <w:pStyle w:val="ListParagraph"/>
+        <w:numPr>
+          <w:ilvl w:val="1"/>
+          <w:numId w:val="2"/>
+        </w:numPr>
+      </w:pPr>
+      <w:r>
+        <w:t>Nonce</w:t>
+      </w:r>
+    </w:p>
+    <w:p>
+      <w:pPr>
+        <w:pStyle w:val="ListParagraph"/>
+        <w:numPr>
+          <w:ilvl w:val="0"/>
+          <w:numId w:val="2"/>
+        </w:numPr>
+      </w:pPr>
+      <w:r>
+        <w:t>Hashing algorithm, I’m using</w:t>
+      </w:r>
+    </w:p>
+    <w:p>
+      <w:pPr>
+        <w:pStyle w:val="ListParagraph"/>
+        <w:numPr>
+          <w:ilvl w:val="1"/>
+          <w:numId w:val="2"/>
+        </w:numPr>
+      </w:pPr>
+      <w:r>
+        <w:t>Builder</w:t>
+      </w:r>
+    </w:p>
+    <w:p>
+      <w:pPr>
+        <w:pStyle w:val="ListParagraph"/>
+        <w:numPr>
+          <w:ilvl w:val="1"/>
+          <w:numId w:val="2"/>
+        </w:numPr>
+      </w:pPr>
+      <w:r>
+        <w:lastRenderedPageBreak/>
+        <w:t>Index</w:t>
+      </w:r>
+    </w:p>
+    <w:p>
+      <w:pPr>
+        <w:pStyle w:val="ListParagraph"/>
+        <w:numPr>
+          <w:ilvl w:val="1"/>
+          <w:numId w:val="2"/>
+        </w:numPr>
+      </w:pPr>
+      <w:proofErr w:type="spellStart"/>
+      <w:r>
+        <w:t>Timestamp.Unix</w:t>
+      </w:r>
+      <w:proofErr w:type="spellEnd"/>
+      <w:r>
+        <w:t>()</w:t>
+      </w:r>
+    </w:p>
+    <w:p>
+      <w:pPr>
+        <w:pStyle w:val="ListParagraph"/>
+        <w:numPr>
+          <w:ilvl w:val="1"/>
+          <w:numId w:val="2"/>
+        </w:numPr>
+      </w:pPr>
+      <w:r>
+        <w:t>Each Transaction</w:t>
+      </w:r>
+    </w:p>
+    <w:p>
+      <w:pPr>
+        <w:pStyle w:val="ListParagraph"/>
+        <w:numPr>
+          <w:ilvl w:val="2"/>
+          <w:numId w:val="2"/>
+        </w:numPr>
+      </w:pPr>
+      <w:r>
+        <w:t>Sender</w:t>
+      </w:r>
+    </w:p>
+    <w:p>
+      <w:pPr>
+        <w:pStyle w:val="ListParagraph"/>
+        <w:numPr>
+          <w:ilvl w:val="2"/>
+          <w:numId w:val="2"/>
+        </w:numPr>
+      </w:pPr>
+      <w:r>
+        <w:t>Recipient</w:t>
+      </w:r>
+    </w:p>
+    <w:p>
+      <w:pPr>
+        <w:pStyle w:val="ListParagraph"/>
+        <w:numPr>
+          <w:ilvl w:val="2"/>
+          <w:numId w:val="2"/>
+        </w:numPr>
+      </w:pPr>
+      <w:r>
+        <w:t>Amount</w:t>
+      </w:r>
+    </w:p>
+    <w:p>
+      <w:pPr>
+        <w:pStyle w:val="ListParagraph"/>
+        <w:numPr>
+          <w:ilvl w:val="1"/>
+          <w:numId w:val="2"/>
+        </w:numPr>
+      </w:pPr>
+      <w:proofErr w:type="spellStart"/>
+      <w:r>
+        <w:t>PreviousHash</w:t>
+      </w:r>
+      <w:proofErr w:type="spellEnd"/>
+    </w:p>
+    <w:p>
+      <w:pPr>
+        <w:pStyle w:val="ListParagraph"/>
+        <w:numPr>
+          <w:ilvl w:val="1"/>
+          <w:numId w:val="2"/>
+        </w:numPr>
+      </w:pPr>
+      <w:r>
+        <w:t>Nonce</w:t>
+      </w:r>
+    </w:p>
+    <w:p>
+      <w:pPr>
+        <w:pStyle w:val="ListParagraph"/>
+        <w:numPr>
+          <w:ilvl w:val="1"/>
+          <w:numId w:val="2"/>
+        </w:numPr>
+      </w:pPr>
+      <w:r>
+        <w:t>SHA-256</w:t>
+      </w:r>
+    </w:p>
+    <w:p>
+      <w:pPr>
+        <w:pStyle w:val="ListParagraph"/>
+        <w:numPr>
+          <w:ilvl w:val="1"/>
+          <w:numId w:val="2"/>
+        </w:numPr>
+      </w:pPr>
+      <w:r>
+        <w:t>Hex String</w:t>
+      </w:r>
+    </w:p>
     <w:sectPr>
       <w:pgSz w:w="12240" w:h="15840"/>
       <w:pgMar w:top="1440" w:right="1440" w:bottom="1440" w:left="1440" w:header="720" w:footer="720" w:gutter="0"/>
@@ -640,8 +878,124 @@
       </w:rPr>
     </w:lvl>
   </w:abstractNum>
+  <w:abstractNum w:abstractNumId="1" w15:restartNumberingAfterBreak="0">
+    <w:nsid w:val="2D123CA7"/>
+    <w:multiLevelType w:val="hybridMultilevel"/>
+    <w:tmpl w:val="32B0DF5A"/>
+    <w:lvl w:ilvl="0" w:tplc="04090001">
+      <w:start w:val="1"/>
+      <w:numFmt w:val="bullet"/>
+      <w:lvlText w:val=""/>
+      <w:lvlJc w:val="left"/>
+      <w:pPr>
+        <w:ind w:left="720" w:hanging="360"/>
+      </w:pPr>
+      <w:rPr>
+        <w:rFonts w:ascii="Symbol" w:hAnsi="Symbol" w:hint="default"/>
+      </w:rPr>
+    </w:lvl>
+    <w:lvl w:ilvl="1" w:tplc="04090003">
+      <w:start w:val="1"/>
+      <w:numFmt w:val="bullet"/>
+      <w:lvlText w:val="o"/>
+      <w:lvlJc w:val="left"/>
+      <w:pPr>
+        <w:ind w:left="1440" w:hanging="360"/>
+      </w:pPr>
+      <w:rPr>
+        <w:rFonts w:ascii="Courier New" w:hAnsi="Courier New" w:cs="Courier New" w:hint="default"/>
+      </w:rPr>
+    </w:lvl>
+    <w:lvl w:ilvl="2" w:tplc="04090005">
+      <w:start w:val="1"/>
+      <w:numFmt w:val="bullet"/>
+      <w:lvlText w:val=""/>
+      <w:lvlJc w:val="left"/>
+      <w:pPr>
+        <w:ind w:left="2160" w:hanging="360"/>
+      </w:pPr>
+      <w:rPr>
+        <w:rFonts w:ascii="Wingdings" w:hAnsi="Wingdings" w:hint="default"/>
+      </w:rPr>
+    </w:lvl>
+    <w:lvl w:ilvl="3" w:tplc="04090001" w:tentative="1">
+      <w:start w:val="1"/>
+      <w:numFmt w:val="bullet"/>
+      <w:lvlText w:val=""/>
+      <w:lvlJc w:val="left"/>
+      <w:pPr>
+        <w:ind w:left="2880" w:hanging="360"/>
+      </w:pPr>
+      <w:rPr>
+        <w:rFonts w:ascii="Symbol" w:hAnsi="Symbol" w:hint="default"/>
+      </w:rPr>
+    </w:lvl>
+    <w:lvl w:ilvl="4" w:tplc="04090003" w:tentative="1">
+      <w:start w:val="1"/>
+      <w:numFmt w:val="bullet"/>
+      <w:lvlText w:val="o"/>
+      <w:lvlJc w:val="left"/>
+      <w:pPr>
+        <w:ind w:left="3600" w:hanging="360"/>
+      </w:pPr>
+      <w:rPr>
+        <w:rFonts w:ascii="Courier New" w:hAnsi="Courier New" w:cs="Courier New" w:hint="default"/>
+      </w:rPr>
+    </w:lvl>
+    <w:lvl w:ilvl="5" w:tplc="04090005" w:tentative="1">
+      <w:start w:val="1"/>
+      <w:numFmt w:val="bullet"/>
+      <w:lvlText w:val=""/>
+      <w:lvlJc w:val="left"/>
+      <w:pPr>
+        <w:ind w:left="4320" w:hanging="360"/>
+      </w:pPr>
+      <w:rPr>
+        <w:rFonts w:ascii="Wingdings" w:hAnsi="Wingdings" w:hint="default"/>
+      </w:rPr>
+    </w:lvl>
+    <w:lvl w:ilvl="6" w:tplc="04090001" w:tentative="1">
+      <w:start w:val="1"/>
+      <w:numFmt w:val="bullet"/>
+      <w:lvlText w:val=""/>
+      <w:lvlJc w:val="left"/>
+      <w:pPr>
+        <w:ind w:left="5040" w:hanging="360"/>
+      </w:pPr>
+      <w:rPr>
+        <w:rFonts w:ascii="Symbol" w:hAnsi="Symbol" w:hint="default"/>
+      </w:rPr>
+    </w:lvl>
+    <w:lvl w:ilvl="7" w:tplc="04090003" w:tentative="1">
+      <w:start w:val="1"/>
+      <w:numFmt w:val="bullet"/>
+      <w:lvlText w:val="o"/>
+      <w:lvlJc w:val="left"/>
+      <w:pPr>
+        <w:ind w:left="5760" w:hanging="360"/>
+      </w:pPr>
+      <w:rPr>
+        <w:rFonts w:ascii="Courier New" w:hAnsi="Courier New" w:cs="Courier New" w:hint="default"/>
+      </w:rPr>
+    </w:lvl>
+    <w:lvl w:ilvl="8" w:tplc="04090005" w:tentative="1">
+      <w:start w:val="1"/>
+      <w:numFmt w:val="bullet"/>
+      <w:lvlText w:val=""/>
+      <w:lvlJc w:val="left"/>
+      <w:pPr>
+        <w:ind w:left="6480" w:hanging="360"/>
+      </w:pPr>
+      <w:rPr>
+        <w:rFonts w:ascii="Wingdings" w:hAnsi="Wingdings" w:hint="default"/>
+      </w:rPr>
+    </w:lvl>
+  </w:abstractNum>
   <w:num w:numId="1">
     <w:abstractNumId w:val="0"/>
+  </w:num>
+  <w:num w:numId="2">
+    <w:abstractNumId w:val="1"/>
   </w:num>
 </w:numbering>
 </file>

</xml_diff>